<commit_message>
Spreadsheets: keep Excel column widths, hide hidden rows/columns, CSV fixes; test-pack file fixes
- Columns keep their Excel widths (table width is now fixed); text runs on into
  empty cells to its right like Excel; full text on hover when cut off
- Hidden rows and columns are no longer shown
- CSV: columns sized to their content (max 420 px), line breaks inside a cell shown
- Online counter: page-type update also sends the timestamp (no permission warning)
- Test pack: Word page 7 back to one column (one <w:cols> per section), PDF gradient
  clipped to its box, 16-bit TIFF uses the full gray range, Excel column B wider
</commit_message>
<xml_diff>
--- a/public/samples/test-pack/test-word.docx
+++ b/public/samples/test-pack/test-word.docx
@@ -2064,9 +2064,8 @@
         <w:sectPr>
           <w:pgSz w:w="12240" w:h="15840"/>
           <w:pgMar w:top="1440" w:right="1800" w:bottom="1440" w:left="1800" w:header="720" w:footer="720" w:gutter="0"/>
-          <w:cols w:space="720"/>
+          <w:cols w:space="720" w:num="2"/>
           <w:docGrid w:linePitch="360"/>
-          <w:cols xmlns:a="http://schemas.openxmlformats.org/drawingml/2006/main" xmlns:pic="http://schemas.openxmlformats.org/drawingml/2006/picture" w:num="2" w:space="720"/>
         </w:sectPr>
       </w:pPr>
     </w:p>
@@ -2109,7 +2108,6 @@
       <w:pgMar w:top="1440" w:right="1800" w:bottom="1440" w:left="1800" w:header="720" w:footer="720" w:gutter="0"/>
       <w:cols w:space="720"/>
       <w:docGrid w:linePitch="360"/>
-      <w:cols xmlns:a="http://schemas.openxmlformats.org/drawingml/2006/main" xmlns:pic="http://schemas.openxmlformats.org/drawingml/2006/picture" w:num="2" w:space="720"/>
     </w:sectPr>
   </w:body>
 </w:document>

</xml_diff>

<commit_message>
Test checklist results; spreadsheet fixes; test-pack file fixes
- TEST-CHECKLIST.xlsx: all 506 tests run on Stage and Angular; Result, notes and
  test date filled in; Summary shows Pass / Fail per file
- Columns keep their Excel widths (table width is now fixed); text runs on into
  empty cells to its right like Excel; full text on hover when cut off
- Hidden rows and columns are no longer shown
- CSV: columns sized to their content (max 420 px), line breaks inside a cell shown
- Online counter: page-type update also sends the timestamp (no permission warning)
- Test pack: Word page 7 back to one column (one <w:cols> per section), PDF gradient
  clipped to its box, 16-bit TIFF uses the full gray range, Excel column B wider
</commit_message>
<xml_diff>
--- a/public/samples/test-pack/test-word.docx
+++ b/public/samples/test-pack/test-word.docx
@@ -2064,9 +2064,8 @@
         <w:sectPr>
           <w:pgSz w:w="12240" w:h="15840"/>
           <w:pgMar w:top="1440" w:right="1800" w:bottom="1440" w:left="1800" w:header="720" w:footer="720" w:gutter="0"/>
-          <w:cols w:space="720"/>
+          <w:cols w:space="720" w:num="2"/>
           <w:docGrid w:linePitch="360"/>
-          <w:cols xmlns:a="http://schemas.openxmlformats.org/drawingml/2006/main" xmlns:pic="http://schemas.openxmlformats.org/drawingml/2006/picture" w:num="2" w:space="720"/>
         </w:sectPr>
       </w:pPr>
     </w:p>
@@ -2109,7 +2108,6 @@
       <w:pgMar w:top="1440" w:right="1800" w:bottom="1440" w:left="1800" w:header="720" w:footer="720" w:gutter="0"/>
       <w:cols w:space="720"/>
       <w:docGrid w:linePitch="360"/>
-      <w:cols xmlns:a="http://schemas.openxmlformats.org/drawingml/2006/main" xmlns:pic="http://schemas.openxmlformats.org/drawingml/2006/picture" w:num="2" w:space="720"/>
     </w:sectPr>
   </w:body>
 </w:document>

</xml_diff>